<commit_message>
fix: describe Apple Developer Academy onboarding work
</commit_message>
<xml_diff>
--- a/cvs/Lucas-Gabriel-Ferreira-CV-en.docx
+++ b/cvs/Lucas-Gabriel-Ferreira-CV-en.docx
@@ -63,7 +63,7 @@
         <w:rPr>
           <w:lang w:val="en-US"/>
         </w:rPr>
-        <w:t>I build PHP and Python APIs and integrations for enterprise systems, industrial monitoring and healthcare operations. At IMD/LABCOMU, I work on projects for Apple, focusing on data synchronization, observability and software quality.</w:t>
+        <w:t>I build PHP and Python APIs and integrations for enterprise systems, industrial monitoring and healthcare operations. At IMD/LABCOMU, I develop systems supporting onboarding at Apple Developer Academies as part of a multinational project, focusing on data synchronization, observability and software quality.</w:t>
       </w:r>
     </w:p>
     <w:p>
@@ -108,7 +108,7 @@
         <w:rPr>
           <w:lang w:val="en-US"/>
         </w:rPr>
-        <w:t>• Develop PHP/Slim REST APIs for international projects with Apple as a client, working directly with stakeholders in English.</w:t>
+        <w:t>• Develop PHP/Slim REST APIs for systems supporting onboarding at Apple Developer Academies, as part of a multinational project with Apple as a client.</w:t>
       </w:r>
     </w:p>
     <w:p>

</xml_diff>